<commit_message>
feat: add project documentation, outreach templates, and supporting educational resources
</commit_message>
<xml_diff>
--- a/docs/Sankofa-Documentacao-Completa.docx
+++ b/docs/Sankofa-Documentacao-Completa.docx
@@ -23533,6 +23533,99 @@
         <w:rPr>
           <w:rStyle w:val="VerbatimChar"/>
         </w:rPr>
+        <w:t xml:space="preserve">**Conformidade com a licença UNESCO**: Sankofa é uma obra derivada da</w:t>
+      </w:r>
+      <w:r>
+        <w:br/>
+      </w:r>
+      <w:r>
+        <w:rPr>
+          <w:rStyle w:val="VerbatimChar"/>
+        </w:rPr>
+        <w:t xml:space="preserve">*General History of Africa* sob os termos da licença Creative Commons</w:t>
+      </w:r>
+      <w:r>
+        <w:br/>
+      </w:r>
+      <w:r>
+        <w:rPr>
+          <w:rStyle w:val="VerbatimChar"/>
+        </w:rPr>
+        <w:t xml:space="preserve">**CC BY-SA IGO 3.0** aplicada às publicações abertas da UNESCO. A</w:t>
+      </w:r>
+      <w:r>
+        <w:br/>
+      </w:r>
+      <w:r>
+        <w:rPr>
+          <w:rStyle w:val="VerbatimChar"/>
+        </w:rPr>
+        <w:t xml:space="preserve">atribuição formal e o disclaimer obrigatório ("The present work is not</w:t>
+      </w:r>
+      <w:r>
+        <w:br/>
+      </w:r>
+      <w:r>
+        <w:rPr>
+          <w:rStyle w:val="VerbatimChar"/>
+        </w:rPr>
+        <w:t xml:space="preserve">an official UNESCO publication and shall not be considered as such")</w:t>
+      </w:r>
+      <w:r>
+        <w:br/>
+      </w:r>
+      <w:r>
+        <w:rPr>
+          <w:rStyle w:val="VerbatimChar"/>
+        </w:rPr>
+        <w:t xml:space="preserve">estão visíveis nas páginas &lt;em&gt;Termos de Uso&lt;/em&gt; e &lt;em&gt;Sobre&lt;/em&gt; do</w:t>
+      </w:r>
+      <w:r>
+        <w:br/>
+      </w:r>
+      <w:r>
+        <w:rPr>
+          <w:rStyle w:val="VerbatimChar"/>
+        </w:rPr>
+        <w:t xml:space="preserve">aplicativo. Sankofa não utiliza o logotipo UNESCO nem reproduz</w:t>
+      </w:r>
+      <w:r>
+        <w:br/>
+      </w:r>
+      <w:r>
+        <w:rPr>
+          <w:rStyle w:val="VerbatimChar"/>
+        </w:rPr>
+        <w:t xml:space="preserve">fotografias da publicação original (ambos fora do escopo da CC BY-SA),</w:t>
+      </w:r>
+      <w:r>
+        <w:br/>
+      </w:r>
+      <w:r>
+        <w:rPr>
+          <w:rStyle w:val="VerbatimChar"/>
+        </w:rPr>
+        <w:t xml:space="preserve">e adota a mesma família de licença (CC BY-SA 4.0) para o conteúdo</w:t>
+      </w:r>
+      <w:r>
+        <w:br/>
+      </w:r>
+      <w:r>
+        <w:rPr>
+          <w:rStyle w:val="VerbatimChar"/>
+        </w:rPr>
+        <w:t xml:space="preserve">adaptado, conforme exigido pela cláusula ShareAlike.</w:t>
+      </w:r>
+      <w:r>
+        <w:br/>
+      </w:r>
+      <w:r>
+        <w:br/>
+      </w:r>
+      <w:r>
+        <w:rPr>
+          <w:rStyle w:val="VerbatimChar"/>
+        </w:rPr>
         <w:t xml:space="preserve">2. Por que o patrocínio interessa à [Empresa]</w:t>
       </w:r>
       <w:r>
@@ -24519,6 +24612,24 @@
           <w:rStyle w:val="VerbatimChar"/>
         </w:rPr>
         <w:t xml:space="preserve">   5.1. MVP funcional — Volumes I–VIII (71 enigmas)</w:t>
+      </w:r>
+      <w:r>
+        <w:br/>
+      </w:r>
+      <w:r>
+        <w:rPr>
+          <w:rStyle w:val="VerbatimChar"/>
+        </w:rPr>
+        <w:t xml:space="preserve">   5.2. Conformidade com licença CC BY-SA IGO 3.0 da UNESCO declarada</w:t>
+      </w:r>
+      <w:r>
+        <w:br/>
+      </w:r>
+      <w:r>
+        <w:rPr>
+          <w:rStyle w:val="VerbatimChar"/>
+        </w:rPr>
+        <w:t xml:space="preserve">        e visível em-app (Termos + Sobre).</w:t>
       </w:r>
       <w:r>
         <w:br/>

</xml_diff>

<commit_message>
chore: update project version and organize documentation, repository templates, and pedagogical roadmap files
</commit_message>
<xml_diff>
--- a/docs/Sankofa-Documentacao-Completa.docx
+++ b/docs/Sankofa-Documentacao-Completa.docx
@@ -5243,7 +5243,25 @@
         <w:pStyle w:val="Compact"/>
       </w:pPr>
       <w:r>
-        <w:t xml:space="preserve">Separar dados em JSON puro para abrir contribuição externa.</w:t>
+        <w:t xml:space="preserve">Separar dados em JSON puro para abrir contribuição externa (planejado para</w:t>
+      </w:r>
+      <w:r>
+        <w:t xml:space="preserve"> </w:t>
+      </w:r>
+      <w:r>
+        <w:t xml:space="preserve">depois do 1º piloto pedagógico — ver</w:t>
+      </w:r>
+      <w:r>
+        <w:t xml:space="preserve"> </w:t>
+      </w:r>
+      <w:r>
+        <w:rPr>
+          <w:rStyle w:val="VerbatimChar"/>
+        </w:rPr>
+        <w:t xml:space="preserve">CONTRIBUTING.md</w:t>
+      </w:r>
+      <w:r>
+        <w:t xml:space="preserve">).</w:t>
       </w:r>
     </w:p>
     <w:p>

</xml_diff>